<commit_message>
quiero ir a casa
</commit_message>
<xml_diff>
--- a/Sistemas/Ejercicio Repaso Subnetting 1.docx
+++ b/Sistemas/Ejercicio Repaso Subnetting 1.docx
@@ -217,14 +217,7 @@
           <w:rFonts w:ascii="Arial" w:eastAsia="Arial" w:hAnsi="Arial" w:cs="Arial"/>
           <w:sz w:val="28"/>
         </w:rPr>
-        <w:t xml:space="preserve">Máscara de Subred </w:t>
-      </w:r>
-      <w:r>
-        <w:rPr>
-          <w:rFonts w:ascii="Arial" w:eastAsia="Arial" w:hAnsi="Arial" w:cs="Arial"/>
-          <w:sz w:val="28"/>
-        </w:rPr>
-        <w:t>Adaptada</w:t>
+        <w:t>Máscara de Subred Adaptada</w:t>
       </w:r>
       <w:r>
         <w:rPr>
@@ -376,10 +369,10 @@
         <w:tblLook w:val="04A0" w:firstRow="1" w:lastRow="0" w:firstColumn="1" w:lastColumn="0" w:noHBand="0" w:noVBand="1"/>
       </w:tblPr>
       <w:tblGrid>
-        <w:gridCol w:w="2517"/>
-        <w:gridCol w:w="2542"/>
-        <w:gridCol w:w="2533"/>
-        <w:gridCol w:w="2516"/>
+        <w:gridCol w:w="2511"/>
+        <w:gridCol w:w="2544"/>
+        <w:gridCol w:w="2544"/>
+        <w:gridCol w:w="2509"/>
       </w:tblGrid>
       <w:tr>
         <w:tc>
@@ -466,102 +459,120 @@
               <w:spacing w:after="5" w:line="250" w:lineRule="auto"/>
             </w:pPr>
             <w:r>
-              <w:t>192.10.10.0</w:t>
-            </w:r>
-          </w:p>
-        </w:tc>
-        <w:tc>
-          <w:tcPr>
-            <w:tcW w:w="2614" w:type="dxa"/>
-          </w:tcPr>
-          <w:p>
-            <w:pPr>
-              <w:spacing w:after="5" w:line="250" w:lineRule="auto"/>
-            </w:pPr>
+              <w:t>192.10.10.16</w:t>
+            </w:r>
+          </w:p>
+        </w:tc>
+        <w:tc>
+          <w:tcPr>
+            <w:tcW w:w="2614" w:type="dxa"/>
+          </w:tcPr>
+          <w:p>
+            <w:pPr>
+              <w:spacing w:after="5" w:line="250" w:lineRule="auto"/>
+            </w:pPr>
+            <w:r>
+              <w:t>192.10.10.31</w:t>
+            </w:r>
+          </w:p>
+        </w:tc>
+        <w:tc>
+          <w:tcPr>
+            <w:tcW w:w="2614" w:type="dxa"/>
+          </w:tcPr>
+          <w:p>
+            <w:pPr>
+              <w:spacing w:after="5" w:line="250" w:lineRule="auto"/>
+            </w:pPr>
+            <w:r>
+              <w:t>.17-30</w:t>
+            </w:r>
+          </w:p>
+        </w:tc>
+      </w:tr>
+      <w:tr>
+        <w:tc>
+          <w:tcPr>
+            <w:tcW w:w="2614" w:type="dxa"/>
+          </w:tcPr>
+          <w:p>
+            <w:pPr>
+              <w:spacing w:after="5" w:line="250" w:lineRule="auto"/>
+              <w:ind w:left="348"/>
+            </w:pPr>
+            <w:r>
+              <w:t>Sb 2</w:t>
+            </w:r>
+          </w:p>
+        </w:tc>
+        <w:tc>
+          <w:tcPr>
+            <w:tcW w:w="2614" w:type="dxa"/>
+          </w:tcPr>
+          <w:p>
+            <w:pPr>
+              <w:spacing w:after="5" w:line="250" w:lineRule="auto"/>
+            </w:pPr>
+            <w:r>
+              <w:t>192.10.10.32</w:t>
+            </w:r>
+          </w:p>
+        </w:tc>
+        <w:tc>
+          <w:tcPr>
+            <w:tcW w:w="2614" w:type="dxa"/>
+          </w:tcPr>
+          <w:p>
+            <w:pPr>
+              <w:spacing w:after="5" w:line="250" w:lineRule="auto"/>
+            </w:pPr>
+            <w:r>
+              <w:t>192.10.10.47</w:t>
+            </w:r>
+          </w:p>
+        </w:tc>
+        <w:tc>
+          <w:tcPr>
+            <w:tcW w:w="2614" w:type="dxa"/>
+          </w:tcPr>
+          <w:p>
+            <w:pPr>
+              <w:spacing w:after="5" w:line="250" w:lineRule="auto"/>
+            </w:pPr>
+          </w:p>
+        </w:tc>
+      </w:tr>
+      <w:tr>
+        <w:tc>
+          <w:tcPr>
+            <w:tcW w:w="2614" w:type="dxa"/>
+          </w:tcPr>
+          <w:p>
+            <w:pPr>
+              <w:spacing w:after="5" w:line="250" w:lineRule="auto"/>
+              <w:ind w:left="348"/>
+            </w:pPr>
+            <w:r>
+              <w:t>Sb 3</w:t>
+            </w:r>
+          </w:p>
+        </w:tc>
+        <w:tc>
+          <w:tcPr>
+            <w:tcW w:w="2614" w:type="dxa"/>
+          </w:tcPr>
+          <w:p>
+            <w:pPr>
+              <w:spacing w:after="5" w:line="250" w:lineRule="auto"/>
+              <w:rPr>
+                <w:u w:val="single"/>
+              </w:rPr>
+            </w:pPr>
+            <w:r>
+              <w:t>192.10.10.48</w:t>
+            </w:r>
             <w:bookmarkStart w:id="0" w:name="_GoBack"/>
             <w:bookmarkEnd w:id="0"/>
-          </w:p>
-        </w:tc>
-        <w:tc>
-          <w:tcPr>
-            <w:tcW w:w="2614" w:type="dxa"/>
-          </w:tcPr>
-          <w:p>
-            <w:pPr>
-              <w:spacing w:after="5" w:line="250" w:lineRule="auto"/>
-            </w:pPr>
-          </w:p>
-        </w:tc>
-      </w:tr>
-      <w:tr>
-        <w:tc>
-          <w:tcPr>
-            <w:tcW w:w="2614" w:type="dxa"/>
-          </w:tcPr>
-          <w:p>
-            <w:pPr>
-              <w:spacing w:after="5" w:line="250" w:lineRule="auto"/>
-              <w:ind w:left="348"/>
-            </w:pPr>
-            <w:r>
-              <w:t>Sb 2</w:t>
-            </w:r>
-          </w:p>
-        </w:tc>
-        <w:tc>
-          <w:tcPr>
-            <w:tcW w:w="2614" w:type="dxa"/>
-          </w:tcPr>
-          <w:p>
-            <w:pPr>
-              <w:spacing w:after="5" w:line="250" w:lineRule="auto"/>
-            </w:pPr>
-          </w:p>
-        </w:tc>
-        <w:tc>
-          <w:tcPr>
-            <w:tcW w:w="2614" w:type="dxa"/>
-          </w:tcPr>
-          <w:p>
-            <w:pPr>
-              <w:spacing w:after="5" w:line="250" w:lineRule="auto"/>
-            </w:pPr>
-          </w:p>
-        </w:tc>
-        <w:tc>
-          <w:tcPr>
-            <w:tcW w:w="2614" w:type="dxa"/>
-          </w:tcPr>
-          <w:p>
-            <w:pPr>
-              <w:spacing w:after="5" w:line="250" w:lineRule="auto"/>
-            </w:pPr>
-          </w:p>
-        </w:tc>
-      </w:tr>
-      <w:tr>
-        <w:tc>
-          <w:tcPr>
-            <w:tcW w:w="2614" w:type="dxa"/>
-          </w:tcPr>
-          <w:p>
-            <w:pPr>
-              <w:spacing w:after="5" w:line="250" w:lineRule="auto"/>
-              <w:ind w:left="348"/>
-            </w:pPr>
-            <w:r>
-              <w:t>Sb 3</w:t>
-            </w:r>
-          </w:p>
-        </w:tc>
-        <w:tc>
-          <w:tcPr>
-            <w:tcW w:w="2614" w:type="dxa"/>
-          </w:tcPr>
-          <w:p>
-            <w:pPr>
-              <w:spacing w:after="5" w:line="250" w:lineRule="auto"/>
-            </w:pPr>
           </w:p>
         </w:tc>
         <w:tc>

</xml_diff>